<commit_message>
Updating the project report
</commit_message>
<xml_diff>
--- a/project-report.docx
+++ b/project-report.docx
@@ -6,99 +6,25 @@
       <w:pPr>
         <w:jc w:val="center"/>
         <w:rPr>
-          <w:rFonts w:ascii="Bell MT" w:hAnsi="Bell MT"/>
           <w:b/>
           <w:bCs/>
           <w:sz w:val="48"/>
           <w:szCs w:val="48"/>
         </w:rPr>
       </w:pPr>
-    </w:p>
-    <w:p>
-      <w:pPr>
-        <w:jc w:val="center"/>
-        <w:rPr>
-          <w:rFonts w:ascii="Bell MT" w:hAnsi="Bell MT"/>
+      <w:r>
+        <w:rPr>
           <w:b/>
           <w:bCs/>
           <w:sz w:val="48"/>
           <w:szCs w:val="48"/>
         </w:rPr>
-      </w:pPr>
-    </w:p>
-    <w:p>
-      <w:pPr>
-        <w:jc w:val="center"/>
-        <w:rPr>
-          <w:rFonts w:ascii="Bell MT" w:hAnsi="Bell MT"/>
-          <w:b/>
-          <w:bCs/>
-          <w:sz w:val="48"/>
-          <w:szCs w:val="48"/>
-        </w:rPr>
-      </w:pPr>
-      <w:r>
-        <w:rPr>
-          <w:rFonts w:ascii="Bell MT" w:hAnsi="Bell MT"/>
-          <w:b/>
-          <w:bCs/>
-          <w:sz w:val="48"/>
-          <w:szCs w:val="48"/>
-        </w:rPr>
-        <w:t>Project Report</w:t>
-      </w:r>
-      <w:r>
-        <w:rPr>
-          <w:b/>
-          <w:bCs/>
-          <w:sz w:val="96"/>
-          <w:szCs w:val="96"/>
-        </w:rPr>
-        <w:t xml:space="preserve">                                     Fundamentals of AI-ML</w:t>
-      </w:r>
-    </w:p>
-    <w:p>
-      <w:pPr>
-        <w:rPr>
-          <w:b/>
-          <w:bCs/>
-        </w:rPr>
-      </w:pPr>
-    </w:p>
-    <w:p>
-      <w:pPr>
-        <w:rPr>
-          <w:b/>
-          <w:bCs/>
-        </w:rPr>
-      </w:pPr>
-    </w:p>
-    <w:p>
-      <w:pPr>
-        <w:rPr>
-          <w:b/>
-          <w:bCs/>
-        </w:rPr>
-      </w:pPr>
-    </w:p>
-    <w:p>
-      <w:pPr>
-        <w:rPr>
-          <w:b/>
-          <w:bCs/>
-        </w:rPr>
-      </w:pPr>
-    </w:p>
-    <w:p>
-      <w:pPr>
-        <w:rPr>
-          <w:b/>
-          <w:bCs/>
-        </w:rPr>
-      </w:pPr>
-    </w:p>
-    <w:p>
-      <w:pPr>
+        <w:t>PROJECT REPORT: FUNDAMENTALS OF AI &amp; ML</w:t>
+      </w:r>
+    </w:p>
+    <w:p>
+      <w:pPr>
+        <w:jc w:val="right"/>
         <w:rPr>
           <w:b/>
           <w:bCs/>
@@ -113,9 +39,8 @@
           <w:sz w:val="36"/>
           <w:szCs w:val="36"/>
         </w:rPr>
-        <w:t>Project title: </w:t>
-      </w:r>
-      <w:proofErr w:type="spellStart"/>
+        <w:t>Project Title: Opti</w:t>
+      </w:r>
       <w:r>
         <w:rPr>
           <w:b/>
@@ -123,7 +48,7 @@
           <w:sz w:val="36"/>
           <w:szCs w:val="36"/>
         </w:rPr>
-        <w:t>Opti</w:t>
+        <w:t>-</w:t>
       </w:r>
       <w:r>
         <w:rPr>
@@ -132,629 +57,616 @@
           <w:sz w:val="36"/>
           <w:szCs w:val="36"/>
         </w:rPr>
-        <w:t>H</w:t>
-      </w:r>
-      <w:r>
-        <w:rPr>
-          <w:b/>
-          <w:bCs/>
-          <w:sz w:val="36"/>
-          <w:szCs w:val="36"/>
-        </w:rPr>
-        <w:t>ostel</w:t>
+        <w:t>Hostel</w:t>
+      </w:r>
+    </w:p>
+    <w:p>
+      <w:pPr>
+        <w:jc w:val="right"/>
+      </w:pPr>
+      <w:r>
+        <w:rPr>
+          <w:b/>
+          <w:bCs/>
+        </w:rPr>
+        <w:t>Student Name</w:t>
+      </w:r>
+      <w:r>
+        <w:rPr>
+          <w:b/>
+          <w:bCs/>
+        </w:rPr>
+        <w:t>: Anupam Bharti</w:t>
+      </w:r>
+    </w:p>
+    <w:p>
+      <w:pPr>
+        <w:jc w:val="right"/>
+      </w:pPr>
+      <w:r>
+        <w:rPr>
+          <w:b/>
+          <w:bCs/>
+        </w:rPr>
+        <w:t>Academic Year:</w:t>
+      </w:r>
+      <w:r>
+        <w:t xml:space="preserve"> 2025-26</w:t>
+      </w:r>
+    </w:p>
+    <w:p>
+      <w:pPr>
+        <w:jc w:val="right"/>
+      </w:pPr>
+      <w:r>
+        <w:t>Registration Number: 25BHI10053</w:t>
+      </w:r>
+    </w:p>
+    <w:p>
+      <w:r>
+        <w:pict w14:anchorId="5D581442">
+          <v:rect id="_x0000_i1067" style="width:0;height:1.5pt" o:hralign="center" o:hrstd="t" o:hr="t" fillcolor="#a0a0a0" stroked="f"/>
+        </w:pict>
+      </w:r>
+    </w:p>
+    <w:p>
+      <w:pPr>
+        <w:rPr>
+          <w:b/>
+          <w:bCs/>
+        </w:rPr>
+      </w:pPr>
+      <w:r>
+        <w:rPr>
+          <w:b/>
+          <w:bCs/>
+        </w:rPr>
+        <w:t>1. Introduction: Why This Project Matters</w:t>
+      </w:r>
+      <w:r>
+        <w:rPr>
+          <w:b/>
+          <w:bCs/>
+        </w:rPr>
+        <w:t>:</w:t>
+      </w:r>
+    </w:p>
+    <w:p>
+      <w:r>
+        <w:t>As</w:t>
+      </w:r>
+      <w:r>
+        <w:t xml:space="preserve"> a resident of the hostel, I’ve seen firsthand the significant impact a roommate can have on one's</w:t>
+      </w:r>
+      <w:r>
+        <w:t xml:space="preserve"> academic performance and mental well-being. If a "Night Owl" who studies at 2 AM is paired with an "Early Bird" who wakes up at 5 AM, both suffer.</w:t>
+      </w:r>
+    </w:p>
+    <w:p>
+      <w:r>
+        <w:t xml:space="preserve">Current hostel allocation is just a random sequence. I chose this problem because it’s a perfect real-world application for </w:t>
+      </w:r>
+      <w:r>
+        <w:rPr>
+          <w:b/>
+          <w:bCs/>
+        </w:rPr>
+        <w:t>Intelligent Agents</w:t>
+      </w:r>
+      <w:r>
+        <w:t>. By using AI to "match" students rather than just "placing" them, we can create a better campus environment.</w:t>
+      </w:r>
+    </w:p>
+    <w:p>
+      <w:r>
+        <w:pict w14:anchorId="170E1C45">
+          <v:rect id="_x0000_i1068" style="width:0;height:1.5pt" o:hralign="center" o:hrstd="t" o:hr="t" fillcolor="#a0a0a0" stroked="f"/>
+        </w:pict>
+      </w:r>
+    </w:p>
+    <w:p>
+      <w:pPr>
+        <w:rPr>
+          <w:b/>
+          <w:bCs/>
+        </w:rPr>
+      </w:pPr>
+      <w:r>
+        <w:rPr>
+          <w:b/>
+          <w:bCs/>
+        </w:rPr>
+        <w:t>2. The Problem Statement</w:t>
+      </w:r>
+      <w:r>
+        <w:rPr>
+          <w:b/>
+          <w:bCs/>
+        </w:rPr>
+        <w:t>:</w:t>
+      </w:r>
+    </w:p>
+    <w:p>
+      <w:r>
+        <w:t>The goal is to design a system that allocates students to rooms while satisfying two types of conditions:</w:t>
+      </w:r>
+    </w:p>
+    <w:p>
+      <w:pPr>
+        <w:numPr>
+          <w:ilvl w:val="0"/>
+          <w:numId w:val="7"/>
+        </w:numPr>
+      </w:pPr>
+      <w:r>
+        <w:rPr>
+          <w:b/>
+          <w:bCs/>
+        </w:rPr>
+        <w:t>Hard Constraints:</w:t>
+      </w:r>
+      <w:r>
+        <w:t xml:space="preserve"> Non-negotiable rules like Gender (Boys/Girls wings) and Facility (AC/Non-AC preference).</w:t>
+      </w:r>
+    </w:p>
+    <w:p>
+      <w:pPr>
+        <w:numPr>
+          <w:ilvl w:val="0"/>
+          <w:numId w:val="7"/>
+        </w:numPr>
+      </w:pPr>
+      <w:r>
+        <w:rPr>
+          <w:b/>
+          <w:bCs/>
+        </w:rPr>
+        <w:t>Soft Constraints:</w:t>
+      </w:r>
+      <w:r>
+        <w:t xml:space="preserve"> Preferences like matching students from the same department or those with similar sleep/study patterns.</w:t>
+      </w:r>
+    </w:p>
+    <w:p>
+      <w:r>
+        <w:pict w14:anchorId="135F32F3">
+          <v:rect id="_x0000_i1069" style="width:0;height:1.5pt" o:hralign="center" o:hrstd="t" o:hr="t" fillcolor="#a0a0a0" stroked="f"/>
+        </w:pict>
+      </w:r>
+    </w:p>
+    <w:p>
+      <w:pPr>
+        <w:rPr>
+          <w:b/>
+          <w:bCs/>
+        </w:rPr>
+      </w:pPr>
+      <w:r>
+        <w:rPr>
+          <w:b/>
+          <w:bCs/>
+        </w:rPr>
+        <w:t>3. My Approach: The Logic</w:t>
+      </w:r>
+      <w:r>
+        <w:rPr>
+          <w:b/>
+          <w:bCs/>
+        </w:rPr>
+        <w:t>:</w:t>
+      </w:r>
+    </w:p>
+    <w:p>
+      <w:r>
+        <w:t xml:space="preserve">I </w:t>
+      </w:r>
+      <w:r>
+        <w:t xml:space="preserve">used </w:t>
+      </w:r>
+      <w:r>
+        <w:rPr>
+          <w:b/>
+          <w:bCs/>
+        </w:rPr>
+        <w:t>Search &amp; Logic</w:t>
+      </w:r>
+      <w:r>
+        <w:rPr>
+          <w:b/>
+          <w:bCs/>
+        </w:rPr>
+        <w:t xml:space="preserve"> </w:t>
+      </w:r>
+      <w:r>
+        <w:t xml:space="preserve">and </w:t>
+      </w:r>
+      <w:r>
+        <w:rPr>
+          <w:b/>
+          <w:bCs/>
+        </w:rPr>
+        <w:t>Intelligent Agents</w:t>
+      </w:r>
+      <w:r>
+        <w:rPr>
+          <w:b/>
+          <w:bCs/>
+        </w:rPr>
+        <w:t xml:space="preserve"> concepts to build this project</w:t>
+      </w:r>
+      <w:r>
+        <w:t>.</w:t>
+      </w:r>
+    </w:p>
+    <w:p>
+      <w:r>
+        <w:t xml:space="preserve">Instead of using a simple list, I treated this as a </w:t>
+      </w:r>
+      <w:r>
+        <w:rPr>
+          <w:b/>
+          <w:bCs/>
+        </w:rPr>
+        <w:t>Search Problem</w:t>
+      </w:r>
+      <w:r>
+        <w:t>. The "Agent" perceives the student data from a CSV file and searches for a room that provides the highest "Utility</w:t>
+      </w:r>
+      <w:proofErr w:type="gramStart"/>
+      <w:r>
+        <w:t xml:space="preserve">" </w:t>
+      </w:r>
+      <w:r>
+        <w:t>.</w:t>
+      </w:r>
+      <w:proofErr w:type="gramEnd"/>
+    </w:p>
+    <w:p>
+      <w:r>
+        <w:rPr>
+          <w:b/>
+          <w:bCs/>
+        </w:rPr>
+        <w:t>The Heuristic Function (h(n)):</w:t>
+      </w:r>
+    </w:p>
+    <w:p>
+      <w:r>
+        <w:lastRenderedPageBreak/>
+        <w:t>To make the "Decision Making" process smart, I implemented a scoring formula:</w:t>
+      </w:r>
+    </w:p>
+    <w:p>
+      <w:r>
+        <w:t>Score = (</w:t>
+      </w:r>
+      <w:proofErr w:type="spellStart"/>
+      <w:r>
+        <w:t>StudyHabitMatch</w:t>
       </w:r>
       <w:proofErr w:type="spellEnd"/>
       <w:r>
-        <w:rPr>
-          <w:b/>
-          <w:bCs/>
-          <w:sz w:val="36"/>
-          <w:szCs w:val="36"/>
-        </w:rPr>
-        <w:t xml:space="preserve"> - Heuristic-Based Room</w:t>
-      </w:r>
-      <w:r>
-        <w:rPr>
-          <w:b/>
-          <w:bCs/>
-          <w:sz w:val="36"/>
-          <w:szCs w:val="36"/>
+        <w:t xml:space="preserve"> \times 2) + (</w:t>
+      </w:r>
+      <w:proofErr w:type="spellStart"/>
+      <w:r>
+        <w:t>MajorMatch</w:t>
+      </w:r>
+      <w:proofErr w:type="spellEnd"/>
+      <w:r>
+        <w:t xml:space="preserve"> \times 1</w:t>
+      </w:r>
+      <w:r>
+        <w:t>)</w:t>
+      </w:r>
+    </w:p>
+    <w:p>
+      <w:r>
+        <w:t xml:space="preserve">I gave a higher weight to </w:t>
+      </w:r>
+      <w:r>
+        <w:rPr>
+          <w:b/>
+          <w:bCs/>
+        </w:rPr>
+        <w:t>Study Habits</w:t>
+      </w:r>
+      <w:r>
+        <w:t xml:space="preserve"> because lifestyle compatibility is more important for long-term peace than just being in the same branch.</w:t>
+      </w:r>
+    </w:p>
+    <w:p>
+      <w:r>
+        <w:pict w14:anchorId="46324A60">
+          <v:rect id="_x0000_i1070" style="width:0;height:1.5pt" o:hralign="center" o:hrstd="t" o:hr="t" fillcolor="#a0a0a0" stroked="f"/>
+        </w:pict>
+      </w:r>
+    </w:p>
+    <w:p>
+      <w:pPr>
+        <w:rPr>
+          <w:b/>
+          <w:bCs/>
+        </w:rPr>
+      </w:pPr>
+      <w:r>
+        <w:rPr>
+          <w:b/>
+          <w:bCs/>
+        </w:rPr>
+        <w:t>4. Key Decisions Made</w:t>
+      </w:r>
+      <w:r>
+        <w:rPr>
+          <w:b/>
+          <w:bCs/>
+        </w:rPr>
+        <w:t>:</w:t>
+      </w:r>
+    </w:p>
+    <w:p>
+      <w:pPr>
+        <w:numPr>
+          <w:ilvl w:val="0"/>
+          <w:numId w:val="8"/>
+        </w:numPr>
+      </w:pPr>
+      <w:r>
+        <w:rPr>
+          <w:b/>
+          <w:bCs/>
+        </w:rPr>
+        <w:t>Python:</w:t>
+      </w:r>
+      <w:r>
+        <w:rPr>
+          <w:b/>
+          <w:bCs/>
         </w:rPr>
         <w:t xml:space="preserve"> </w:t>
       </w:r>
       <w:r>
-        <w:rPr>
-          <w:b/>
-          <w:bCs/>
-          <w:sz w:val="36"/>
-          <w:szCs w:val="36"/>
-        </w:rPr>
-        <w:t>Allotment</w:t>
-      </w:r>
-      <w:r>
-        <w:rPr>
-          <w:b/>
-          <w:bCs/>
-          <w:sz w:val="36"/>
-          <w:szCs w:val="36"/>
-        </w:rPr>
-        <w:br/>
-      </w:r>
-      <w:r>
-        <w:rPr>
-          <w:b/>
-          <w:bCs/>
-          <w:sz w:val="36"/>
-          <w:szCs w:val="36"/>
-        </w:rPr>
-        <w:t>Student</w:t>
-      </w:r>
-      <w:r>
-        <w:rPr>
-          <w:b/>
-          <w:bCs/>
-          <w:sz w:val="36"/>
-          <w:szCs w:val="36"/>
-        </w:rPr>
-        <w:t xml:space="preserve"> name: </w:t>
-      </w:r>
-      <w:r>
-        <w:rPr>
-          <w:b/>
-          <w:bCs/>
-          <w:sz w:val="36"/>
-          <w:szCs w:val="36"/>
-        </w:rPr>
-        <w:t>Anupam Bharti</w:t>
-      </w:r>
-      <w:r>
-        <w:rPr>
-          <w:b/>
-          <w:bCs/>
-          <w:sz w:val="36"/>
-          <w:szCs w:val="36"/>
-        </w:rPr>
-        <w:br/>
-      </w:r>
-      <w:r>
-        <w:rPr>
-          <w:b/>
-          <w:bCs/>
-          <w:sz w:val="36"/>
-          <w:szCs w:val="36"/>
-        </w:rPr>
-        <w:t>R</w:t>
-      </w:r>
-      <w:r>
-        <w:rPr>
-          <w:b/>
-          <w:bCs/>
-          <w:sz w:val="36"/>
-          <w:szCs w:val="36"/>
-        </w:rPr>
-        <w:t>egistration number: 25</w:t>
-      </w:r>
-      <w:r>
-        <w:rPr>
-          <w:b/>
-          <w:bCs/>
-          <w:sz w:val="36"/>
-          <w:szCs w:val="36"/>
-        </w:rPr>
-        <w:t>BHI</w:t>
-      </w:r>
-      <w:r>
-        <w:rPr>
-          <w:b/>
-          <w:bCs/>
-          <w:sz w:val="36"/>
-          <w:szCs w:val="36"/>
-        </w:rPr>
-        <w:t>10053</w:t>
-      </w:r>
-      <w:r>
-        <w:rPr>
-          <w:b/>
-          <w:bCs/>
-          <w:sz w:val="36"/>
-          <w:szCs w:val="36"/>
-        </w:rPr>
-        <w:br/>
-      </w:r>
-      <w:r>
-        <w:rPr>
-          <w:b/>
-          <w:bCs/>
-          <w:sz w:val="36"/>
-          <w:szCs w:val="36"/>
-        </w:rPr>
-        <w:t>Co</w:t>
-      </w:r>
-      <w:r>
-        <w:rPr>
-          <w:b/>
-          <w:bCs/>
-          <w:sz w:val="36"/>
-          <w:szCs w:val="36"/>
-        </w:rPr>
-        <w:t>urse: </w:t>
-      </w:r>
-      <w:r>
-        <w:rPr>
-          <w:b/>
-          <w:bCs/>
-          <w:sz w:val="36"/>
-          <w:szCs w:val="36"/>
-        </w:rPr>
-        <w:t>F</w:t>
-      </w:r>
-      <w:r>
-        <w:rPr>
-          <w:b/>
-          <w:bCs/>
-          <w:sz w:val="36"/>
-          <w:szCs w:val="36"/>
-        </w:rPr>
-        <w:t xml:space="preserve">undamentals of </w:t>
-      </w:r>
-      <w:r>
-        <w:rPr>
-          <w:b/>
-          <w:bCs/>
-          <w:sz w:val="36"/>
-          <w:szCs w:val="36"/>
-        </w:rPr>
-        <w:t>AI-ML</w:t>
-      </w:r>
-      <w:r>
-        <w:rPr>
-          <w:b/>
-          <w:bCs/>
-          <w:sz w:val="36"/>
-          <w:szCs w:val="36"/>
-        </w:rPr>
-        <w:t xml:space="preserve"> (</w:t>
-      </w:r>
+        <w:t>I chose Python because it allows for easier data handling and is more practical for building a CLI tool that an actual hostel warden could use.</w:t>
+      </w:r>
+    </w:p>
+    <w:p>
+      <w:pPr>
+        <w:numPr>
+          <w:ilvl w:val="0"/>
+          <w:numId w:val="8"/>
+        </w:numPr>
+      </w:pPr>
+      <w:r>
+        <w:rPr>
+          <w:b/>
+          <w:bCs/>
+        </w:rPr>
+        <w:t>Greedy Approach:</w:t>
+      </w:r>
+      <w:r>
+        <w:t xml:space="preserve"> I decided on a greedy heuristic search. As soon as the agent finds a "Good Enough" match, it finalizes the allocation. This keeps the algorithm fast and efficient.</w:t>
+      </w:r>
+    </w:p>
+    <w:p>
+      <w:pPr>
+        <w:numPr>
+          <w:ilvl w:val="0"/>
+          <w:numId w:val="8"/>
+        </w:numPr>
+      </w:pPr>
+      <w:r>
+        <w:rPr>
+          <w:b/>
+          <w:bCs/>
+        </w:rPr>
+        <w:t>Fallback Logic:</w:t>
+      </w:r>
+      <w:r>
+        <w:t xml:space="preserve"> I made sure the agent has "Rationality." If it can't find a perfect match, it doesn't crash; it finds the next best available spot to ensure every student gets a room.</w:t>
+      </w:r>
+    </w:p>
+    <w:p>
+      <w:r>
+        <w:pict w14:anchorId="125C2443">
+          <v:rect id="_x0000_i1071" style="width:0;height:1.5pt" o:hralign="center" o:hrstd="t" o:hr="t" fillcolor="#a0a0a0" stroked="f"/>
+        </w:pict>
+      </w:r>
+    </w:p>
+    <w:p>
+      <w:pPr>
+        <w:rPr>
+          <w:b/>
+          <w:bCs/>
+        </w:rPr>
+      </w:pPr>
+      <w:r>
+        <w:rPr>
+          <w:b/>
+          <w:bCs/>
+        </w:rPr>
+        <w:t>5. Challenges Faced</w:t>
+      </w:r>
+      <w:r>
+        <w:rPr>
+          <w:b/>
+          <w:bCs/>
+        </w:rPr>
+        <w:t>:</w:t>
+      </w:r>
+    </w:p>
+    <w:p>
+      <w:pPr>
+        <w:numPr>
+          <w:ilvl w:val="0"/>
+          <w:numId w:val="9"/>
+        </w:numPr>
+      </w:pPr>
+      <w:r>
+        <w:rPr>
+          <w:b/>
+          <w:bCs/>
+        </w:rPr>
+        <w:t xml:space="preserve">Data Representation: </w:t>
+      </w:r>
+      <w:r>
+        <w:t>At first, it was difficult to figure out how to represent "Habits" in a way a computer could understand. I decided to classify them into "Early Bird" and "Night Owl" to simplify the calculations.</w:t>
+      </w:r>
+    </w:p>
+    <w:p>
+      <w:pPr>
+        <w:numPr>
+          <w:ilvl w:val="0"/>
+          <w:numId w:val="9"/>
+        </w:numPr>
+      </w:pPr>
+      <w:r>
+        <w:rPr>
+          <w:b/>
+          <w:bCs/>
+        </w:rPr>
+        <w:t>Constraint Conflicts:</w:t>
+      </w:r>
+      <w:r>
+        <w:t xml:space="preserve"> Handling cases where a student wants an AC room but all AC rooms are full was a challenge. I solved this by prioritizing Hard Constraints first.</w:t>
+      </w:r>
+    </w:p>
+    <w:p>
+      <w:pPr>
+        <w:numPr>
+          <w:ilvl w:val="0"/>
+          <w:numId w:val="9"/>
+        </w:numPr>
+      </w:pPr>
+      <w:r>
+        <w:rPr>
+          <w:b/>
+          <w:bCs/>
+        </w:rPr>
+        <w:t>Indentation and Logic:</w:t>
+      </w:r>
+      <w:r>
+        <w:t xml:space="preserve"> As a developer, ensuring the Python logic for nested loops (checking rooms vs. checking occupants) stayed clean was a learning curve.</w:t>
+      </w:r>
+    </w:p>
+    <w:p>
+      <w:r>
+        <w:pict w14:anchorId="73E7DA94">
+          <v:rect id="_x0000_i1072" style="width:0;height:1.5pt" o:hralign="center" o:hrstd="t" o:hr="t" fillcolor="#a0a0a0" stroked="f"/>
+        </w:pict>
+      </w:r>
+    </w:p>
+    <w:p>
+      <w:pPr>
+        <w:rPr>
+          <w:b/>
+          <w:bCs/>
+        </w:rPr>
+      </w:pPr>
+      <w:r>
+        <w:rPr>
+          <w:b/>
+          <w:bCs/>
+        </w:rPr>
+        <w:t>6. What I Learned</w:t>
+      </w:r>
+    </w:p>
+    <w:p>
+      <w:r>
+        <w:t>This project helped me bridge the gap between theory and practice. I learned that:</w:t>
+      </w:r>
+    </w:p>
+    <w:p>
+      <w:pPr>
+        <w:numPr>
+          <w:ilvl w:val="0"/>
+          <w:numId w:val="10"/>
+        </w:numPr>
+      </w:pPr>
+      <w:r>
+        <w:rPr>
+          <w:b/>
+          <w:bCs/>
+        </w:rPr>
+        <w:t>AI isn't just about Robots:</w:t>
+      </w:r>
+      <w:r>
+        <w:t xml:space="preserve"> Simple logic and heuristics can solve huge logistical problems.</w:t>
+      </w:r>
+    </w:p>
+    <w:p>
+      <w:pPr>
+        <w:numPr>
+          <w:ilvl w:val="0"/>
+          <w:numId w:val="10"/>
+        </w:numPr>
+      </w:pPr>
+      <w:r>
+        <w:rPr>
+          <w:b/>
+          <w:bCs/>
+        </w:rPr>
+        <w:t>The Importance of Weights:</w:t>
+      </w:r>
+      <w:r>
+        <w:t xml:space="preserve"> Changing a weight in a heuristic formula can completely change the final outcome of a project.</w:t>
+      </w:r>
+    </w:p>
+    <w:p>
+      <w:pPr>
+        <w:numPr>
+          <w:ilvl w:val="0"/>
+          <w:numId w:val="10"/>
+        </w:numPr>
+      </w:pPr>
+      <w:r>
+        <w:rPr>
+          <w:b/>
+          <w:bCs/>
+        </w:rPr>
+        <w:t>Data is Key:</w:t>
+      </w:r>
+      <w:r>
+        <w:t xml:space="preserve"> An AI is only as good as the features (like major or habit) you give it.</w:t>
+      </w:r>
+    </w:p>
+    <w:p>
+      <w:r>
+        <w:lastRenderedPageBreak/>
+        <w:pict w14:anchorId="20B96178">
+          <v:rect id="_x0000_i1073" style="width:0;height:1.5pt" o:hralign="center" o:hrstd="t" o:hr="t" fillcolor="#a0a0a0" stroked="f"/>
+        </w:pict>
+      </w:r>
+    </w:p>
+    <w:p>
+      <w:pPr>
+        <w:rPr>
+          <w:b/>
+          <w:bCs/>
+        </w:rPr>
+      </w:pPr>
+      <w:r>
+        <w:rPr>
+          <w:b/>
+          <w:bCs/>
+        </w:rPr>
+        <w:t>7. Conclusion</w:t>
+      </w:r>
+    </w:p>
+    <w:p>
       <w:proofErr w:type="spellStart"/>
       <w:r>
         <w:rPr>
           <w:b/>
           <w:bCs/>
-          <w:sz w:val="36"/>
-          <w:szCs w:val="36"/>
-        </w:rPr>
-        <w:t>V</w:t>
-      </w:r>
-      <w:r>
-        <w:rPr>
-          <w:b/>
-          <w:bCs/>
-          <w:sz w:val="36"/>
-          <w:szCs w:val="36"/>
-        </w:rPr>
-        <w:t>ityarthi</w:t>
+        </w:rPr>
+        <w:t>OptiHostel</w:t>
       </w:r>
       <w:proofErr w:type="spellEnd"/>
       <w:r>
-        <w:rPr>
-          <w:b/>
-          <w:bCs/>
-          <w:sz w:val="36"/>
-          <w:szCs w:val="36"/>
-        </w:rPr>
-        <w:t>-project)</w:t>
-      </w:r>
-    </w:p>
-    <w:p>
-      <w:pPr>
-        <w:rPr>
-          <w:b/>
-          <w:bCs/>
-          <w:sz w:val="36"/>
-          <w:szCs w:val="36"/>
-        </w:rPr>
-      </w:pPr>
-    </w:p>
-    <w:p>
-      <w:pPr>
-        <w:rPr>
-          <w:b/>
-          <w:bCs/>
-          <w:sz w:val="36"/>
-          <w:szCs w:val="36"/>
-        </w:rPr>
-      </w:pPr>
-    </w:p>
-    <w:p>
-      <w:pPr>
-        <w:rPr>
-          <w:b/>
-          <w:bCs/>
-          <w:sz w:val="36"/>
-          <w:szCs w:val="36"/>
-        </w:rPr>
-      </w:pPr>
-    </w:p>
-    <w:p>
-      <w:pPr>
-        <w:rPr>
-          <w:b/>
-          <w:bCs/>
-          <w:sz w:val="36"/>
-          <w:szCs w:val="36"/>
-        </w:rPr>
-      </w:pPr>
-    </w:p>
-    <w:p>
-      <w:pPr>
-        <w:rPr>
-          <w:b/>
-          <w:bCs/>
-          <w:sz w:val="36"/>
-          <w:szCs w:val="36"/>
-        </w:rPr>
-      </w:pPr>
-    </w:p>
-    <w:p>
-      <w:pPr>
-        <w:rPr>
-          <w:b/>
-          <w:bCs/>
-          <w:sz w:val="36"/>
-          <w:szCs w:val="36"/>
-        </w:rPr>
-      </w:pPr>
-    </w:p>
-    <w:p>
-      <w:pPr>
-        <w:rPr>
-          <w:b/>
-          <w:bCs/>
-          <w:sz w:val="36"/>
-          <w:szCs w:val="36"/>
-        </w:rPr>
-      </w:pPr>
-    </w:p>
-    <w:p>
-      <w:pPr>
-        <w:rPr>
-          <w:b/>
-          <w:bCs/>
-          <w:sz w:val="36"/>
-          <w:szCs w:val="36"/>
-        </w:rPr>
-      </w:pPr>
-      <w:r>
-        <w:rPr>
-          <w:b/>
-          <w:bCs/>
-          <w:sz w:val="36"/>
-          <w:szCs w:val="36"/>
-        </w:rPr>
-        <w:lastRenderedPageBreak/>
-        <w:t>1. Introduction</w:t>
-      </w:r>
-    </w:p>
-    <w:p>
-      <w:pPr>
-        <w:rPr>
-          <w:sz w:val="36"/>
-          <w:szCs w:val="36"/>
-        </w:rPr>
-      </w:pPr>
-      <w:r>
-        <w:rPr>
-          <w:sz w:val="36"/>
-          <w:szCs w:val="36"/>
-        </w:rPr>
-        <w:t>Hostel life is an important part of engineering education. Incompatibility in roommates may distract the students. The project aims at automating the process with the application of search strategies that are part of the engineering curriculum.</w:t>
-      </w:r>
-    </w:p>
-    <w:p>
-      <w:pPr>
-        <w:rPr>
-          <w:b/>
-          <w:bCs/>
-          <w:sz w:val="36"/>
-          <w:szCs w:val="36"/>
-        </w:rPr>
-      </w:pPr>
-      <w:r>
-        <w:rPr>
-          <w:b/>
-          <w:bCs/>
-          <w:sz w:val="36"/>
-          <w:szCs w:val="36"/>
-        </w:rPr>
-        <w:t>2. Nature of Environment</w:t>
-      </w:r>
-    </w:p>
-    <w:p>
-      <w:pPr>
-        <w:rPr>
-          <w:sz w:val="36"/>
-          <w:szCs w:val="36"/>
-        </w:rPr>
-      </w:pPr>
-      <w:r>
-        <w:rPr>
-          <w:sz w:val="36"/>
-          <w:szCs w:val="36"/>
-        </w:rPr>
-        <w:t>Discrete: The number of rooms and students is countable.</w:t>
-      </w:r>
-    </w:p>
-    <w:p>
-      <w:pPr>
-        <w:rPr>
-          <w:sz w:val="36"/>
-          <w:szCs w:val="36"/>
-        </w:rPr>
-      </w:pPr>
-      <w:r>
-        <w:rPr>
-          <w:sz w:val="36"/>
-          <w:szCs w:val="36"/>
-        </w:rPr>
-        <w:t>Static: The data of the students does not vary during the process.</w:t>
-      </w:r>
-    </w:p>
-    <w:p>
-      <w:pPr>
-        <w:rPr>
-          <w:sz w:val="36"/>
-          <w:szCs w:val="36"/>
-        </w:rPr>
-      </w:pPr>
-      <w:r>
-        <w:rPr>
-          <w:sz w:val="36"/>
-          <w:szCs w:val="36"/>
-        </w:rPr>
-        <w:t>Deterministic: The same data will be processed in the same way.</w:t>
-      </w:r>
-    </w:p>
-    <w:p>
-      <w:pPr>
-        <w:rPr>
-          <w:b/>
-          <w:bCs/>
-          <w:sz w:val="36"/>
-          <w:szCs w:val="36"/>
-        </w:rPr>
-      </w:pPr>
-      <w:r>
-        <w:rPr>
-          <w:b/>
-          <w:bCs/>
-          <w:sz w:val="36"/>
-          <w:szCs w:val="36"/>
-        </w:rPr>
-        <w:t>3. Problem Solving Strategy</w:t>
-      </w:r>
-    </w:p>
-    <w:p>
-      <w:pPr>
-        <w:rPr>
-          <w:sz w:val="36"/>
-          <w:szCs w:val="36"/>
-        </w:rPr>
-      </w:pPr>
-      <w:r>
-        <w:rPr>
-          <w:sz w:val="36"/>
-          <w:szCs w:val="36"/>
-        </w:rPr>
-        <w:t>The project uses the Greedy Heuristic Search Algorithm.</w:t>
-      </w:r>
-    </w:p>
-    <w:p>
-      <w:pPr>
-        <w:rPr>
-          <w:sz w:val="36"/>
-          <w:szCs w:val="36"/>
-        </w:rPr>
-      </w:pPr>
-      <w:r>
-        <w:rPr>
-          <w:sz w:val="36"/>
-          <w:szCs w:val="36"/>
-        </w:rPr>
-        <w:t>State Space: All possible combinations of students in rooms.</w:t>
-      </w:r>
-    </w:p>
-    <w:p>
-      <w:pPr>
-        <w:rPr>
-          <w:sz w:val="36"/>
-          <w:szCs w:val="36"/>
-        </w:rPr>
-      </w:pPr>
-      <w:r>
-        <w:rPr>
-          <w:sz w:val="36"/>
-          <w:szCs w:val="36"/>
-        </w:rPr>
-        <w:t>Heuristic Function (h(n)): Running the formula for h(n).</w:t>
-      </w:r>
-    </w:p>
-    <w:p>
-      <w:pPr>
-        <w:rPr>
-          <w:b/>
-          <w:bCs/>
-          <w:sz w:val="36"/>
-          <w:szCs w:val="36"/>
-        </w:rPr>
-      </w:pPr>
-    </w:p>
-    <w:p>
-      <w:pPr>
-        <w:rPr>
-          <w:b/>
-          <w:bCs/>
-          <w:sz w:val="36"/>
-          <w:szCs w:val="36"/>
-        </w:rPr>
-      </w:pPr>
-      <w:r>
-        <w:rPr>
-          <w:b/>
-          <w:bCs/>
-          <w:sz w:val="36"/>
-          <w:szCs w:val="36"/>
-        </w:rPr>
-        <w:t>4. Implementation Details</w:t>
-      </w:r>
-    </w:p>
-    <w:p>
-      <w:pPr>
-        <w:rPr>
-          <w:b/>
-          <w:bCs/>
-          <w:sz w:val="36"/>
-          <w:szCs w:val="36"/>
-        </w:rPr>
-      </w:pPr>
-      <w:r>
-        <w:rPr>
-          <w:b/>
-          <w:bCs/>
-          <w:sz w:val="36"/>
-          <w:szCs w:val="36"/>
-        </w:rPr>
-        <w:t>The agent uses the following logic:</w:t>
-      </w:r>
-    </w:p>
-    <w:p>
-      <w:pPr>
-        <w:rPr>
-          <w:b/>
-          <w:bCs/>
-          <w:sz w:val="36"/>
-          <w:szCs w:val="36"/>
-        </w:rPr>
-      </w:pPr>
-      <w:r>
-        <w:rPr>
-          <w:b/>
-          <w:bCs/>
-          <w:sz w:val="36"/>
-          <w:szCs w:val="36"/>
-        </w:rPr>
-        <w:t xml:space="preserve">Filter (Hard Constraints): </w:t>
-      </w:r>
-      <w:r>
-        <w:rPr>
-          <w:sz w:val="36"/>
-          <w:szCs w:val="36"/>
-        </w:rPr>
-        <w:t>Segregate the students according to Gender and AC/Non-AC preferences.</w:t>
-      </w:r>
-    </w:p>
-    <w:p>
-      <w:pPr>
-        <w:rPr>
-          <w:b/>
-          <w:bCs/>
-          <w:sz w:val="36"/>
-          <w:szCs w:val="36"/>
-        </w:rPr>
-      </w:pPr>
-      <w:r>
-        <w:rPr>
-          <w:b/>
-          <w:bCs/>
-          <w:sz w:val="36"/>
-          <w:szCs w:val="36"/>
-        </w:rPr>
-        <w:t xml:space="preserve">Search: </w:t>
-      </w:r>
-      <w:r>
-        <w:rPr>
-          <w:sz w:val="36"/>
-          <w:szCs w:val="36"/>
-        </w:rPr>
-        <w:t>Iterate through the rooms.</w:t>
-      </w:r>
-    </w:p>
-    <w:p>
-      <w:pPr>
-        <w:tabs>
-          <w:tab w:val="num" w:pos="720"/>
-        </w:tabs>
-        <w:rPr>
-          <w:sz w:val="36"/>
-          <w:szCs w:val="36"/>
-        </w:rPr>
-      </w:pPr>
-      <w:r>
-        <w:rPr>
-          <w:b/>
-          <w:bCs/>
-          <w:sz w:val="36"/>
-          <w:szCs w:val="36"/>
-        </w:rPr>
-        <w:lastRenderedPageBreak/>
-        <w:t xml:space="preserve">Compare: </w:t>
-      </w:r>
-      <w:r>
-        <w:rPr>
-          <w:sz w:val="36"/>
-          <w:szCs w:val="36"/>
-        </w:rPr>
-        <w:t>If the room has one student, compute the compatibility using the heuristic function</w:t>
-      </w:r>
-    </w:p>
-    <w:p>
-      <w:pPr>
-        <w:rPr>
-          <w:sz w:val="36"/>
-          <w:szCs w:val="36"/>
-        </w:rPr>
-      </w:pPr>
-      <w:r>
-        <w:rPr>
-          <w:b/>
-          <w:bCs/>
-          <w:sz w:val="36"/>
-          <w:szCs w:val="36"/>
-        </w:rPr>
-        <w:t>Decide:</w:t>
-      </w:r>
-      <w:r>
-        <w:rPr>
-          <w:sz w:val="36"/>
-          <w:szCs w:val="36"/>
-        </w:rPr>
-        <w:t xml:space="preserve"> If the score is ≥ 2, then final decision is made. Otherwise, look for the next best available slot.</w:t>
-      </w:r>
-    </w:p>
-    <w:p>
-      <w:pPr>
-        <w:ind w:firstLine="720"/>
-        <w:rPr>
-          <w:sz w:val="36"/>
-          <w:szCs w:val="36"/>
-        </w:rPr>
-      </w:pPr>
-      <w:r>
-        <w:rPr>
-          <w:b/>
-          <w:bCs/>
-          <w:sz w:val="36"/>
-          <w:szCs w:val="36"/>
-        </w:rPr>
-        <w:t xml:space="preserve">Conclusion: </w:t>
-      </w:r>
-      <w:r>
-        <w:rPr>
-          <w:sz w:val="36"/>
-          <w:szCs w:val="36"/>
-        </w:rPr>
-        <w:t>By employing search strategies, it is possible to reduce roommate conflicts by 60% compared to random assignment. This proves that Intelligent Agents are useful in campus administration.</w:t>
-      </w:r>
-    </w:p>
+        <w:t xml:space="preserve"> proves that fundamental AI concepts like Constraint Satisfaction can make college life smoother. By moving from random allocation to "Intelligent Allocation," we can use technology to improve the student experience at its most basic level—where we live.</w:t>
+      </w:r>
+    </w:p>
+    <w:p/>
     <w:sectPr>
       <w:pgSz w:w="12240" w:h="15840"/>
       <w:pgMar w:top="1440" w:right="1440" w:bottom="1440" w:left="1440" w:header="720" w:footer="720" w:gutter="0"/>
@@ -768,6 +680,119 @@
 <file path=word/numbering.xml><?xml version="1.0" encoding="utf-8"?>
 <w:numbering xmlns:wpc="http://schemas.microsoft.com/office/word/2010/wordprocessingCanvas" xmlns:cx="http://schemas.microsoft.com/office/drawing/2014/chartex" xmlns:cx1="http://schemas.microsoft.com/office/drawing/2015/9/8/chartex" xmlns:cx2="http://schemas.microsoft.com/office/drawing/2015/10/21/chartex" xmlns:cx3="http://schemas.microsoft.com/office/drawing/2016/5/9/chartex" xmlns:cx4="http://schemas.microsoft.com/office/drawing/2016/5/10/chartex" xmlns:cx5="http://schemas.microsoft.com/office/drawing/2016/5/11/chartex" xmlns:cx6="http://schemas.microsoft.com/office/drawing/2016/5/12/chartex" xmlns:cx7="http://schemas.microsoft.com/office/drawing/2016/5/13/chartex" xmlns:cx8="http://schemas.microsoft.com/office/drawing/2016/5/14/chartex" xmlns:mc="http://schemas.openxmlformats.org/markup-compatibility/2006" xmlns:aink="http://schemas.microsoft.com/office/drawing/2016/ink" xmlns:am3d="http://schemas.microsoft.com/office/drawing/2017/model3d" xmlns:o="urn:schemas-microsoft-com:office:office" xmlns:oel="http://schemas.microsoft.com/office/2019/extlst" xmlns:r="http://schemas.openxmlformats.org/officeDocument/2006/relationships" xmlns:m="http://schemas.openxmlformats.org/officeDocument/2006/math" xmlns:v="urn:schemas-microsoft-com:vml" xmlns:wp14="http://schemas.microsoft.com/office/word/2010/wordprocessingDrawing" xmlns:wp="http://schemas.openxmlformats.org/drawingml/2006/wordprocessingDrawing" xmlns:w10="urn:schemas-microsoft-com:office:word" xmlns:w="http://schemas.openxmlformats.org/wordprocessingml/2006/main" xmlns:w14="http://schemas.microsoft.com/office/word/2010/wordml" xmlns:w15="http://schemas.microsoft.com/office/word/2012/wordml" xmlns:w16cex="http://schemas.microsoft.com/office/word/2018/wordml/cex" xmlns:w16cid="http://schemas.microsoft.com/office/word/2016/wordml/cid" xmlns:w16="http://schemas.microsoft.com/office/word/2018/wordml" xmlns:w16du="http://schemas.microsoft.com/office/word/2023/wordml/word16du" xmlns:w16sdtdh="http://schemas.microsoft.com/office/word/2020/wordml/sdtdatahash" xmlns:w16sdtfl="http://schemas.microsoft.com/office/word/2024/wordml/sdtformatlock" xmlns:w16se="http://schemas.microsoft.com/office/word/2015/wordml/symex" xmlns:wpg="http://schemas.microsoft.com/office/word/2010/wordprocessingGroup" xmlns:wpi="http://schemas.microsoft.com/office/word/2010/wordprocessingInk" xmlns:wne="http://schemas.microsoft.com/office/word/2006/wordml" xmlns:wps="http://schemas.microsoft.com/office/word/2010/wordprocessingShape" mc:Ignorable="w14 w15 w16se w16cid w16 w16cex w16sdtdh w16sdtfl w16du wp14">
   <w:abstractNum w:abstractNumId="0" w15:restartNumberingAfterBreak="0">
+    <w:nsid w:val="05745739"/>
+    <w:multiLevelType w:val="multilevel"/>
+    <w:tmpl w:val="F036DD56"/>
+    <w:lvl w:ilvl="0">
+      <w:start w:val="1"/>
+      <w:numFmt w:val="decimal"/>
+      <w:lvlText w:val="%1."/>
+      <w:lvlJc w:val="left"/>
+      <w:pPr>
+        <w:tabs>
+          <w:tab w:val="num" w:pos="720"/>
+        </w:tabs>
+        <w:ind w:left="720" w:hanging="360"/>
+      </w:pPr>
+    </w:lvl>
+    <w:lvl w:ilvl="1" w:tentative="1">
+      <w:start w:val="1"/>
+      <w:numFmt w:val="decimal"/>
+      <w:lvlText w:val="%2."/>
+      <w:lvlJc w:val="left"/>
+      <w:pPr>
+        <w:tabs>
+          <w:tab w:val="num" w:pos="1440"/>
+        </w:tabs>
+        <w:ind w:left="1440" w:hanging="360"/>
+      </w:pPr>
+    </w:lvl>
+    <w:lvl w:ilvl="2" w:tentative="1">
+      <w:start w:val="1"/>
+      <w:numFmt w:val="decimal"/>
+      <w:lvlText w:val="%3."/>
+      <w:lvlJc w:val="left"/>
+      <w:pPr>
+        <w:tabs>
+          <w:tab w:val="num" w:pos="2160"/>
+        </w:tabs>
+        <w:ind w:left="2160" w:hanging="360"/>
+      </w:pPr>
+    </w:lvl>
+    <w:lvl w:ilvl="3" w:tentative="1">
+      <w:start w:val="1"/>
+      <w:numFmt w:val="decimal"/>
+      <w:lvlText w:val="%4."/>
+      <w:lvlJc w:val="left"/>
+      <w:pPr>
+        <w:tabs>
+          <w:tab w:val="num" w:pos="2880"/>
+        </w:tabs>
+        <w:ind w:left="2880" w:hanging="360"/>
+      </w:pPr>
+    </w:lvl>
+    <w:lvl w:ilvl="4" w:tentative="1">
+      <w:start w:val="1"/>
+      <w:numFmt w:val="decimal"/>
+      <w:lvlText w:val="%5."/>
+      <w:lvlJc w:val="left"/>
+      <w:pPr>
+        <w:tabs>
+          <w:tab w:val="num" w:pos="3600"/>
+        </w:tabs>
+        <w:ind w:left="3600" w:hanging="360"/>
+      </w:pPr>
+    </w:lvl>
+    <w:lvl w:ilvl="5" w:tentative="1">
+      <w:start w:val="1"/>
+      <w:numFmt w:val="decimal"/>
+      <w:lvlText w:val="%6."/>
+      <w:lvlJc w:val="left"/>
+      <w:pPr>
+        <w:tabs>
+          <w:tab w:val="num" w:pos="4320"/>
+        </w:tabs>
+        <w:ind w:left="4320" w:hanging="360"/>
+      </w:pPr>
+    </w:lvl>
+    <w:lvl w:ilvl="6" w:tentative="1">
+      <w:start w:val="1"/>
+      <w:numFmt w:val="decimal"/>
+      <w:lvlText w:val="%7."/>
+      <w:lvlJc w:val="left"/>
+      <w:pPr>
+        <w:tabs>
+          <w:tab w:val="num" w:pos="5040"/>
+        </w:tabs>
+        <w:ind w:left="5040" w:hanging="360"/>
+      </w:pPr>
+    </w:lvl>
+    <w:lvl w:ilvl="7" w:tentative="1">
+      <w:start w:val="1"/>
+      <w:numFmt w:val="decimal"/>
+      <w:lvlText w:val="%8."/>
+      <w:lvlJc w:val="left"/>
+      <w:pPr>
+        <w:tabs>
+          <w:tab w:val="num" w:pos="5760"/>
+        </w:tabs>
+        <w:ind w:left="5760" w:hanging="360"/>
+      </w:pPr>
+    </w:lvl>
+    <w:lvl w:ilvl="8" w:tentative="1">
+      <w:start w:val="1"/>
+      <w:numFmt w:val="decimal"/>
+      <w:lvlText w:val="%9."/>
+      <w:lvlJc w:val="left"/>
+      <w:pPr>
+        <w:tabs>
+          <w:tab w:val="num" w:pos="6480"/>
+        </w:tabs>
+        <w:ind w:left="6480" w:hanging="360"/>
+      </w:pPr>
+    </w:lvl>
+  </w:abstractNum>
+  <w:abstractNum w:abstractNumId="1" w15:restartNumberingAfterBreak="0">
     <w:nsid w:val="08665F6C"/>
     <w:multiLevelType w:val="multilevel"/>
     <w:tmpl w:val="DA78E0A0"/>
@@ -880,7 +905,7 @@
       </w:pPr>
     </w:lvl>
   </w:abstractNum>
-  <w:abstractNum w:abstractNumId="1" w15:restartNumberingAfterBreak="0">
+  <w:abstractNum w:abstractNumId="2" w15:restartNumberingAfterBreak="0">
     <w:nsid w:val="3101347C"/>
     <w:multiLevelType w:val="hybridMultilevel"/>
     <w:tmpl w:val="75802E5C"/>
@@ -993,7 +1018,156 @@
       </w:rPr>
     </w:lvl>
   </w:abstractNum>
-  <w:abstractNum w:abstractNumId="2" w15:restartNumberingAfterBreak="0">
+  <w:abstractNum w:abstractNumId="3" w15:restartNumberingAfterBreak="0">
+    <w:nsid w:val="3A470409"/>
+    <w:multiLevelType w:val="multilevel"/>
+    <w:tmpl w:val="F24CDEC6"/>
+    <w:lvl w:ilvl="0">
+      <w:start w:val="1"/>
+      <w:numFmt w:val="bullet"/>
+      <w:lvlText w:val=""/>
+      <w:lvlJc w:val="left"/>
+      <w:pPr>
+        <w:tabs>
+          <w:tab w:val="num" w:pos="720"/>
+        </w:tabs>
+        <w:ind w:left="720" w:hanging="360"/>
+      </w:pPr>
+      <w:rPr>
+        <w:rFonts w:ascii="Symbol" w:hAnsi="Symbol" w:hint="default"/>
+        <w:sz w:val="20"/>
+      </w:rPr>
+    </w:lvl>
+    <w:lvl w:ilvl="1" w:tentative="1">
+      <w:start w:val="1"/>
+      <w:numFmt w:val="bullet"/>
+      <w:lvlText w:val="o"/>
+      <w:lvlJc w:val="left"/>
+      <w:pPr>
+        <w:tabs>
+          <w:tab w:val="num" w:pos="1440"/>
+        </w:tabs>
+        <w:ind w:left="1440" w:hanging="360"/>
+      </w:pPr>
+      <w:rPr>
+        <w:rFonts w:ascii="Courier New" w:hAnsi="Courier New" w:hint="default"/>
+        <w:sz w:val="20"/>
+      </w:rPr>
+    </w:lvl>
+    <w:lvl w:ilvl="2" w:tentative="1">
+      <w:start w:val="1"/>
+      <w:numFmt w:val="bullet"/>
+      <w:lvlText w:val=""/>
+      <w:lvlJc w:val="left"/>
+      <w:pPr>
+        <w:tabs>
+          <w:tab w:val="num" w:pos="2160"/>
+        </w:tabs>
+        <w:ind w:left="2160" w:hanging="360"/>
+      </w:pPr>
+      <w:rPr>
+        <w:rFonts w:ascii="Wingdings" w:hAnsi="Wingdings" w:hint="default"/>
+        <w:sz w:val="20"/>
+      </w:rPr>
+    </w:lvl>
+    <w:lvl w:ilvl="3" w:tentative="1">
+      <w:start w:val="1"/>
+      <w:numFmt w:val="bullet"/>
+      <w:lvlText w:val=""/>
+      <w:lvlJc w:val="left"/>
+      <w:pPr>
+        <w:tabs>
+          <w:tab w:val="num" w:pos="2880"/>
+        </w:tabs>
+        <w:ind w:left="2880" w:hanging="360"/>
+      </w:pPr>
+      <w:rPr>
+        <w:rFonts w:ascii="Wingdings" w:hAnsi="Wingdings" w:hint="default"/>
+        <w:sz w:val="20"/>
+      </w:rPr>
+    </w:lvl>
+    <w:lvl w:ilvl="4" w:tentative="1">
+      <w:start w:val="1"/>
+      <w:numFmt w:val="bullet"/>
+      <w:lvlText w:val=""/>
+      <w:lvlJc w:val="left"/>
+      <w:pPr>
+        <w:tabs>
+          <w:tab w:val="num" w:pos="3600"/>
+        </w:tabs>
+        <w:ind w:left="3600" w:hanging="360"/>
+      </w:pPr>
+      <w:rPr>
+        <w:rFonts w:ascii="Wingdings" w:hAnsi="Wingdings" w:hint="default"/>
+        <w:sz w:val="20"/>
+      </w:rPr>
+    </w:lvl>
+    <w:lvl w:ilvl="5" w:tentative="1">
+      <w:start w:val="1"/>
+      <w:numFmt w:val="bullet"/>
+      <w:lvlText w:val=""/>
+      <w:lvlJc w:val="left"/>
+      <w:pPr>
+        <w:tabs>
+          <w:tab w:val="num" w:pos="4320"/>
+        </w:tabs>
+        <w:ind w:left="4320" w:hanging="360"/>
+      </w:pPr>
+      <w:rPr>
+        <w:rFonts w:ascii="Wingdings" w:hAnsi="Wingdings" w:hint="default"/>
+        <w:sz w:val="20"/>
+      </w:rPr>
+    </w:lvl>
+    <w:lvl w:ilvl="6" w:tentative="1">
+      <w:start w:val="1"/>
+      <w:numFmt w:val="bullet"/>
+      <w:lvlText w:val=""/>
+      <w:lvlJc w:val="left"/>
+      <w:pPr>
+        <w:tabs>
+          <w:tab w:val="num" w:pos="5040"/>
+        </w:tabs>
+        <w:ind w:left="5040" w:hanging="360"/>
+      </w:pPr>
+      <w:rPr>
+        <w:rFonts w:ascii="Wingdings" w:hAnsi="Wingdings" w:hint="default"/>
+        <w:sz w:val="20"/>
+      </w:rPr>
+    </w:lvl>
+    <w:lvl w:ilvl="7" w:tentative="1">
+      <w:start w:val="1"/>
+      <w:numFmt w:val="bullet"/>
+      <w:lvlText w:val=""/>
+      <w:lvlJc w:val="left"/>
+      <w:pPr>
+        <w:tabs>
+          <w:tab w:val="num" w:pos="5760"/>
+        </w:tabs>
+        <w:ind w:left="5760" w:hanging="360"/>
+      </w:pPr>
+      <w:rPr>
+        <w:rFonts w:ascii="Wingdings" w:hAnsi="Wingdings" w:hint="default"/>
+        <w:sz w:val="20"/>
+      </w:rPr>
+    </w:lvl>
+    <w:lvl w:ilvl="8" w:tentative="1">
+      <w:start w:val="1"/>
+      <w:numFmt w:val="bullet"/>
+      <w:lvlText w:val=""/>
+      <w:lvlJc w:val="left"/>
+      <w:pPr>
+        <w:tabs>
+          <w:tab w:val="num" w:pos="6480"/>
+        </w:tabs>
+        <w:ind w:left="6480" w:hanging="360"/>
+      </w:pPr>
+      <w:rPr>
+        <w:rFonts w:ascii="Wingdings" w:hAnsi="Wingdings" w:hint="default"/>
+        <w:sz w:val="20"/>
+      </w:rPr>
+    </w:lvl>
+  </w:abstractNum>
+  <w:abstractNum w:abstractNumId="4" w15:restartNumberingAfterBreak="0">
     <w:nsid w:val="429166E4"/>
     <w:multiLevelType w:val="multilevel"/>
     <w:tmpl w:val="01A44854"/>
@@ -1142,7 +1316,156 @@
       </w:rPr>
     </w:lvl>
   </w:abstractNum>
-  <w:abstractNum w:abstractNumId="3" w15:restartNumberingAfterBreak="0">
+  <w:abstractNum w:abstractNumId="5" w15:restartNumberingAfterBreak="0">
+    <w:nsid w:val="52815776"/>
+    <w:multiLevelType w:val="multilevel"/>
+    <w:tmpl w:val="38604342"/>
+    <w:lvl w:ilvl="0">
+      <w:start w:val="1"/>
+      <w:numFmt w:val="bullet"/>
+      <w:lvlText w:val=""/>
+      <w:lvlJc w:val="left"/>
+      <w:pPr>
+        <w:tabs>
+          <w:tab w:val="num" w:pos="720"/>
+        </w:tabs>
+        <w:ind w:left="720" w:hanging="360"/>
+      </w:pPr>
+      <w:rPr>
+        <w:rFonts w:ascii="Symbol" w:hAnsi="Symbol" w:hint="default"/>
+        <w:sz w:val="20"/>
+      </w:rPr>
+    </w:lvl>
+    <w:lvl w:ilvl="1" w:tentative="1">
+      <w:start w:val="1"/>
+      <w:numFmt w:val="bullet"/>
+      <w:lvlText w:val="o"/>
+      <w:lvlJc w:val="left"/>
+      <w:pPr>
+        <w:tabs>
+          <w:tab w:val="num" w:pos="1440"/>
+        </w:tabs>
+        <w:ind w:left="1440" w:hanging="360"/>
+      </w:pPr>
+      <w:rPr>
+        <w:rFonts w:ascii="Courier New" w:hAnsi="Courier New" w:hint="default"/>
+        <w:sz w:val="20"/>
+      </w:rPr>
+    </w:lvl>
+    <w:lvl w:ilvl="2" w:tentative="1">
+      <w:start w:val="1"/>
+      <w:numFmt w:val="bullet"/>
+      <w:lvlText w:val=""/>
+      <w:lvlJc w:val="left"/>
+      <w:pPr>
+        <w:tabs>
+          <w:tab w:val="num" w:pos="2160"/>
+        </w:tabs>
+        <w:ind w:left="2160" w:hanging="360"/>
+      </w:pPr>
+      <w:rPr>
+        <w:rFonts w:ascii="Wingdings" w:hAnsi="Wingdings" w:hint="default"/>
+        <w:sz w:val="20"/>
+      </w:rPr>
+    </w:lvl>
+    <w:lvl w:ilvl="3" w:tentative="1">
+      <w:start w:val="1"/>
+      <w:numFmt w:val="bullet"/>
+      <w:lvlText w:val=""/>
+      <w:lvlJc w:val="left"/>
+      <w:pPr>
+        <w:tabs>
+          <w:tab w:val="num" w:pos="2880"/>
+        </w:tabs>
+        <w:ind w:left="2880" w:hanging="360"/>
+      </w:pPr>
+      <w:rPr>
+        <w:rFonts w:ascii="Wingdings" w:hAnsi="Wingdings" w:hint="default"/>
+        <w:sz w:val="20"/>
+      </w:rPr>
+    </w:lvl>
+    <w:lvl w:ilvl="4" w:tentative="1">
+      <w:start w:val="1"/>
+      <w:numFmt w:val="bullet"/>
+      <w:lvlText w:val=""/>
+      <w:lvlJc w:val="left"/>
+      <w:pPr>
+        <w:tabs>
+          <w:tab w:val="num" w:pos="3600"/>
+        </w:tabs>
+        <w:ind w:left="3600" w:hanging="360"/>
+      </w:pPr>
+      <w:rPr>
+        <w:rFonts w:ascii="Wingdings" w:hAnsi="Wingdings" w:hint="default"/>
+        <w:sz w:val="20"/>
+      </w:rPr>
+    </w:lvl>
+    <w:lvl w:ilvl="5" w:tentative="1">
+      <w:start w:val="1"/>
+      <w:numFmt w:val="bullet"/>
+      <w:lvlText w:val=""/>
+      <w:lvlJc w:val="left"/>
+      <w:pPr>
+        <w:tabs>
+          <w:tab w:val="num" w:pos="4320"/>
+        </w:tabs>
+        <w:ind w:left="4320" w:hanging="360"/>
+      </w:pPr>
+      <w:rPr>
+        <w:rFonts w:ascii="Wingdings" w:hAnsi="Wingdings" w:hint="default"/>
+        <w:sz w:val="20"/>
+      </w:rPr>
+    </w:lvl>
+    <w:lvl w:ilvl="6" w:tentative="1">
+      <w:start w:val="1"/>
+      <w:numFmt w:val="bullet"/>
+      <w:lvlText w:val=""/>
+      <w:lvlJc w:val="left"/>
+      <w:pPr>
+        <w:tabs>
+          <w:tab w:val="num" w:pos="5040"/>
+        </w:tabs>
+        <w:ind w:left="5040" w:hanging="360"/>
+      </w:pPr>
+      <w:rPr>
+        <w:rFonts w:ascii="Wingdings" w:hAnsi="Wingdings" w:hint="default"/>
+        <w:sz w:val="20"/>
+      </w:rPr>
+    </w:lvl>
+    <w:lvl w:ilvl="7" w:tentative="1">
+      <w:start w:val="1"/>
+      <w:numFmt w:val="bullet"/>
+      <w:lvlText w:val=""/>
+      <w:lvlJc w:val="left"/>
+      <w:pPr>
+        <w:tabs>
+          <w:tab w:val="num" w:pos="5760"/>
+        </w:tabs>
+        <w:ind w:left="5760" w:hanging="360"/>
+      </w:pPr>
+      <w:rPr>
+        <w:rFonts w:ascii="Wingdings" w:hAnsi="Wingdings" w:hint="default"/>
+        <w:sz w:val="20"/>
+      </w:rPr>
+    </w:lvl>
+    <w:lvl w:ilvl="8" w:tentative="1">
+      <w:start w:val="1"/>
+      <w:numFmt w:val="bullet"/>
+      <w:lvlText w:val=""/>
+      <w:lvlJc w:val="left"/>
+      <w:pPr>
+        <w:tabs>
+          <w:tab w:val="num" w:pos="6480"/>
+        </w:tabs>
+        <w:ind w:left="6480" w:hanging="360"/>
+      </w:pPr>
+      <w:rPr>
+        <w:rFonts w:ascii="Wingdings" w:hAnsi="Wingdings" w:hint="default"/>
+        <w:sz w:val="20"/>
+      </w:rPr>
+    </w:lvl>
+  </w:abstractNum>
+  <w:abstractNum w:abstractNumId="6" w15:restartNumberingAfterBreak="0">
     <w:nsid w:val="557542CC"/>
     <w:multiLevelType w:val="hybridMultilevel"/>
     <w:tmpl w:val="C284FD80"/>
@@ -1255,7 +1578,7 @@
       </w:rPr>
     </w:lvl>
   </w:abstractNum>
-  <w:abstractNum w:abstractNumId="4" w15:restartNumberingAfterBreak="0">
+  <w:abstractNum w:abstractNumId="7" w15:restartNumberingAfterBreak="0">
     <w:nsid w:val="63F041DC"/>
     <w:multiLevelType w:val="multilevel"/>
     <w:tmpl w:val="AFA61440"/>
@@ -1404,7 +1727,120 @@
       </w:rPr>
     </w:lvl>
   </w:abstractNum>
-  <w:abstractNum w:abstractNumId="5" w15:restartNumberingAfterBreak="0">
+  <w:abstractNum w:abstractNumId="8" w15:restartNumberingAfterBreak="0">
+    <w:nsid w:val="6C235132"/>
+    <w:multiLevelType w:val="multilevel"/>
+    <w:tmpl w:val="88ACD99C"/>
+    <w:lvl w:ilvl="0">
+      <w:start w:val="1"/>
+      <w:numFmt w:val="decimal"/>
+      <w:lvlText w:val="%1."/>
+      <w:lvlJc w:val="left"/>
+      <w:pPr>
+        <w:tabs>
+          <w:tab w:val="num" w:pos="720"/>
+        </w:tabs>
+        <w:ind w:left="720" w:hanging="360"/>
+      </w:pPr>
+    </w:lvl>
+    <w:lvl w:ilvl="1" w:tentative="1">
+      <w:start w:val="1"/>
+      <w:numFmt w:val="decimal"/>
+      <w:lvlText w:val="%2."/>
+      <w:lvlJc w:val="left"/>
+      <w:pPr>
+        <w:tabs>
+          <w:tab w:val="num" w:pos="1440"/>
+        </w:tabs>
+        <w:ind w:left="1440" w:hanging="360"/>
+      </w:pPr>
+    </w:lvl>
+    <w:lvl w:ilvl="2" w:tentative="1">
+      <w:start w:val="1"/>
+      <w:numFmt w:val="decimal"/>
+      <w:lvlText w:val="%3."/>
+      <w:lvlJc w:val="left"/>
+      <w:pPr>
+        <w:tabs>
+          <w:tab w:val="num" w:pos="2160"/>
+        </w:tabs>
+        <w:ind w:left="2160" w:hanging="360"/>
+      </w:pPr>
+    </w:lvl>
+    <w:lvl w:ilvl="3" w:tentative="1">
+      <w:start w:val="1"/>
+      <w:numFmt w:val="decimal"/>
+      <w:lvlText w:val="%4."/>
+      <w:lvlJc w:val="left"/>
+      <w:pPr>
+        <w:tabs>
+          <w:tab w:val="num" w:pos="2880"/>
+        </w:tabs>
+        <w:ind w:left="2880" w:hanging="360"/>
+      </w:pPr>
+    </w:lvl>
+    <w:lvl w:ilvl="4" w:tentative="1">
+      <w:start w:val="1"/>
+      <w:numFmt w:val="decimal"/>
+      <w:lvlText w:val="%5."/>
+      <w:lvlJc w:val="left"/>
+      <w:pPr>
+        <w:tabs>
+          <w:tab w:val="num" w:pos="3600"/>
+        </w:tabs>
+        <w:ind w:left="3600" w:hanging="360"/>
+      </w:pPr>
+    </w:lvl>
+    <w:lvl w:ilvl="5" w:tentative="1">
+      <w:start w:val="1"/>
+      <w:numFmt w:val="decimal"/>
+      <w:lvlText w:val="%6."/>
+      <w:lvlJc w:val="left"/>
+      <w:pPr>
+        <w:tabs>
+          <w:tab w:val="num" w:pos="4320"/>
+        </w:tabs>
+        <w:ind w:left="4320" w:hanging="360"/>
+      </w:pPr>
+    </w:lvl>
+    <w:lvl w:ilvl="6" w:tentative="1">
+      <w:start w:val="1"/>
+      <w:numFmt w:val="decimal"/>
+      <w:lvlText w:val="%7."/>
+      <w:lvlJc w:val="left"/>
+      <w:pPr>
+        <w:tabs>
+          <w:tab w:val="num" w:pos="5040"/>
+        </w:tabs>
+        <w:ind w:left="5040" w:hanging="360"/>
+      </w:pPr>
+    </w:lvl>
+    <w:lvl w:ilvl="7" w:tentative="1">
+      <w:start w:val="1"/>
+      <w:numFmt w:val="decimal"/>
+      <w:lvlText w:val="%8."/>
+      <w:lvlJc w:val="left"/>
+      <w:pPr>
+        <w:tabs>
+          <w:tab w:val="num" w:pos="5760"/>
+        </w:tabs>
+        <w:ind w:left="5760" w:hanging="360"/>
+      </w:pPr>
+    </w:lvl>
+    <w:lvl w:ilvl="8" w:tentative="1">
+      <w:start w:val="1"/>
+      <w:numFmt w:val="decimal"/>
+      <w:lvlText w:val="%9."/>
+      <w:lvlJc w:val="left"/>
+      <w:pPr>
+        <w:tabs>
+          <w:tab w:val="num" w:pos="6480"/>
+        </w:tabs>
+        <w:ind w:left="6480" w:hanging="360"/>
+      </w:pPr>
+    </w:lvl>
+  </w:abstractNum>
+  <w:abstractNum w:abstractNumId="9" w15:restartNumberingAfterBreak="0">
     <w:nsid w:val="7DDE06E3"/>
     <w:multiLevelType w:val="hybridMultilevel"/>
     <w:tmpl w:val="A148C648"/>
@@ -1518,22 +1954,34 @@
     </w:lvl>
   </w:abstractNum>
   <w:num w:numId="1" w16cid:durableId="535000316">
+    <w:abstractNumId w:val="7"/>
+  </w:num>
+  <w:num w:numId="2" w16cid:durableId="486751023">
     <w:abstractNumId w:val="4"/>
   </w:num>
-  <w:num w:numId="2" w16cid:durableId="486751023">
+  <w:num w:numId="3" w16cid:durableId="1860897442">
+    <w:abstractNumId w:val="1"/>
+  </w:num>
+  <w:num w:numId="4" w16cid:durableId="2046054049">
     <w:abstractNumId w:val="2"/>
   </w:num>
-  <w:num w:numId="3" w16cid:durableId="1860897442">
-    <w:abstractNumId w:val="0"/>
+  <w:num w:numId="5" w16cid:durableId="1059208881">
+    <w:abstractNumId w:val="6"/>
   </w:num>
-  <w:num w:numId="4" w16cid:durableId="2046054049">
-    <w:abstractNumId w:val="1"/>
+  <w:num w:numId="6" w16cid:durableId="564947832">
+    <w:abstractNumId w:val="9"/>
   </w:num>
-  <w:num w:numId="5" w16cid:durableId="1059208881">
+  <w:num w:numId="7" w16cid:durableId="1532648251">
+    <w:abstractNumId w:val="8"/>
+  </w:num>
+  <w:num w:numId="8" w16cid:durableId="1849908975">
     <w:abstractNumId w:val="3"/>
   </w:num>
-  <w:num w:numId="6" w16cid:durableId="564947832">
+  <w:num w:numId="9" w16cid:durableId="1691224541">
     <w:abstractNumId w:val="5"/>
+  </w:num>
+  <w:num w:numId="10" w16cid:durableId="1844398545">
+    <w:abstractNumId w:val="0"/>
   </w:num>
 </w:numbering>
 </file>

</xml_diff>